<commit_message>
tvc delete design folder and upgrade video link
</commit_message>
<xml_diff>
--- a/TVC/Huong Dan VPS tu Git.docx
+++ b/TVC/Huong Dan VPS tu Git.docx
@@ -346,6 +346,13 @@
       <w:r>
         <w:t>cd ~/couple-photo-album git pull pnpm install pnpm build pm2 restart couple-photo-album</w:t>
       </w:r>
+    </w:p>
+    <w:p>
+      <w:pPr>
+        <w:rPr>
+          <w:lang w:val="en-US"/>
+        </w:rPr>
+      </w:pPr>
     </w:p>
     <w:p>
       <w:pPr>
@@ -848,6 +855,118 @@
       </w:rPr>
     </w:lvl>
   </w:abstractNum>
+  <w:abstractNum w:abstractNumId="4" w15:restartNumberingAfterBreak="0">
+    <w:nsid w:val="6DEF3DF3"/>
+    <w:multiLevelType w:val="hybridMultilevel"/>
+    <w:tmpl w:val="9A180ACC"/>
+    <w:lvl w:ilvl="0" w:tplc="798EB260">
+      <w:numFmt w:val="bullet"/>
+      <w:lvlText w:val="-"/>
+      <w:lvlJc w:val="left"/>
+      <w:pPr>
+        <w:ind w:left="720" w:hanging="360"/>
+      </w:pPr>
+      <w:rPr>
+        <w:rFonts w:ascii="Arial" w:eastAsiaTheme="minorHAnsi" w:hAnsi="Arial" w:cs="Arial" w:hint="default"/>
+      </w:rPr>
+    </w:lvl>
+    <w:lvl w:ilvl="1" w:tplc="042A0003" w:tentative="1">
+      <w:start w:val="1"/>
+      <w:numFmt w:val="bullet"/>
+      <w:lvlText w:val="o"/>
+      <w:lvlJc w:val="left"/>
+      <w:pPr>
+        <w:ind w:left="1440" w:hanging="360"/>
+      </w:pPr>
+      <w:rPr>
+        <w:rFonts w:ascii="Courier New" w:hAnsi="Courier New" w:cs="Courier New" w:hint="default"/>
+      </w:rPr>
+    </w:lvl>
+    <w:lvl w:ilvl="2" w:tplc="042A0005" w:tentative="1">
+      <w:start w:val="1"/>
+      <w:numFmt w:val="bullet"/>
+      <w:lvlText w:val=""/>
+      <w:lvlJc w:val="left"/>
+      <w:pPr>
+        <w:ind w:left="2160" w:hanging="360"/>
+      </w:pPr>
+      <w:rPr>
+        <w:rFonts w:ascii="Wingdings" w:hAnsi="Wingdings" w:hint="default"/>
+      </w:rPr>
+    </w:lvl>
+    <w:lvl w:ilvl="3" w:tplc="042A0001" w:tentative="1">
+      <w:start w:val="1"/>
+      <w:numFmt w:val="bullet"/>
+      <w:lvlText w:val=""/>
+      <w:lvlJc w:val="left"/>
+      <w:pPr>
+        <w:ind w:left="2880" w:hanging="360"/>
+      </w:pPr>
+      <w:rPr>
+        <w:rFonts w:ascii="Symbol" w:hAnsi="Symbol" w:hint="default"/>
+      </w:rPr>
+    </w:lvl>
+    <w:lvl w:ilvl="4" w:tplc="042A0003" w:tentative="1">
+      <w:start w:val="1"/>
+      <w:numFmt w:val="bullet"/>
+      <w:lvlText w:val="o"/>
+      <w:lvlJc w:val="left"/>
+      <w:pPr>
+        <w:ind w:left="3600" w:hanging="360"/>
+      </w:pPr>
+      <w:rPr>
+        <w:rFonts w:ascii="Courier New" w:hAnsi="Courier New" w:cs="Courier New" w:hint="default"/>
+      </w:rPr>
+    </w:lvl>
+    <w:lvl w:ilvl="5" w:tplc="042A0005" w:tentative="1">
+      <w:start w:val="1"/>
+      <w:numFmt w:val="bullet"/>
+      <w:lvlText w:val=""/>
+      <w:lvlJc w:val="left"/>
+      <w:pPr>
+        <w:ind w:left="4320" w:hanging="360"/>
+      </w:pPr>
+      <w:rPr>
+        <w:rFonts w:ascii="Wingdings" w:hAnsi="Wingdings" w:hint="default"/>
+      </w:rPr>
+    </w:lvl>
+    <w:lvl w:ilvl="6" w:tplc="042A0001" w:tentative="1">
+      <w:start w:val="1"/>
+      <w:numFmt w:val="bullet"/>
+      <w:lvlText w:val=""/>
+      <w:lvlJc w:val="left"/>
+      <w:pPr>
+        <w:ind w:left="5040" w:hanging="360"/>
+      </w:pPr>
+      <w:rPr>
+        <w:rFonts w:ascii="Symbol" w:hAnsi="Symbol" w:hint="default"/>
+      </w:rPr>
+    </w:lvl>
+    <w:lvl w:ilvl="7" w:tplc="042A0003" w:tentative="1">
+      <w:start w:val="1"/>
+      <w:numFmt w:val="bullet"/>
+      <w:lvlText w:val="o"/>
+      <w:lvlJc w:val="left"/>
+      <w:pPr>
+        <w:ind w:left="5760" w:hanging="360"/>
+      </w:pPr>
+      <w:rPr>
+        <w:rFonts w:ascii="Courier New" w:hAnsi="Courier New" w:cs="Courier New" w:hint="default"/>
+      </w:rPr>
+    </w:lvl>
+    <w:lvl w:ilvl="8" w:tplc="042A0005" w:tentative="1">
+      <w:start w:val="1"/>
+      <w:numFmt w:val="bullet"/>
+      <w:lvlText w:val=""/>
+      <w:lvlJc w:val="left"/>
+      <w:pPr>
+        <w:ind w:left="6480" w:hanging="360"/>
+      </w:pPr>
+      <w:rPr>
+        <w:rFonts w:ascii="Wingdings" w:hAnsi="Wingdings" w:hint="default"/>
+      </w:rPr>
+    </w:lvl>
+  </w:abstractNum>
   <w:num w:numId="1" w16cid:durableId="384374941">
     <w:abstractNumId w:val="0"/>
   </w:num>
@@ -859,6 +978,9 @@
   </w:num>
   <w:num w:numId="4" w16cid:durableId="1379166466">
     <w:abstractNumId w:val="1"/>
+  </w:num>
+  <w:num w:numId="5" w16cid:durableId="2145586781">
+    <w:abstractNumId w:val="4"/>
   </w:num>
 </w:numbering>
 </file>

</xml_diff>